<commit_message>
Bump version to 0.4.2
</commit_message>
<xml_diff>
--- a/templates/_templates/annals-reference.docx
+++ b/templates/_templates/annals-reference.docx
@@ -380,6 +380,7 @@
     </w:pPr>
     <w:rPr>
       <w:rFonts w:ascii="Times New Roman" w:hAnsi="Times New Roman"/>
+      <w:color w:val="000000"/>
       <w:sz w:val="24"/>
     </w:rPr>
   </w:style>
@@ -445,9 +446,10 @@
       <w:rFonts w:asciiTheme="majorHAnsi" w:eastAsiaTheme="majorEastAsia" w:hAnsiTheme="majorHAnsi" w:cstheme="majorBidi" w:ascii="Times New Roman" w:hAnsi="Times New Roman"/>
       <w:b/>
       <w:bCs/>
-      <w:color w:val="365F91" w:themeColor="accent1" w:themeShade="BF"/>
+      <w:color w:val="000000"/>
       <w:sz w:val="28"/>
       <w:szCs w:val="28"/>
+      <w:u w:val="none"/>
     </w:rPr>
   </w:style>
   <w:style w:type="paragraph" w:styleId="Heading2">
@@ -469,9 +471,10 @@
       <w:rFonts w:asciiTheme="majorHAnsi" w:eastAsiaTheme="majorEastAsia" w:hAnsiTheme="majorHAnsi" w:cstheme="majorBidi" w:ascii="Times New Roman" w:hAnsi="Times New Roman"/>
       <w:b/>
       <w:bCs/>
-      <w:color w:val="4F81BD" w:themeColor="accent1"/>
+      <w:color w:val="000000"/>
       <w:sz w:val="24"/>
       <w:szCs w:val="26"/>
+      <w:u w:val="none"/>
     </w:rPr>
   </w:style>
   <w:style w:type="paragraph" w:styleId="Heading3">
@@ -486,15 +489,17 @@
     <w:pPr>
       <w:keepNext/>
       <w:keepLines/>
-      <w:spacing w:before="240" w:after="120" w:line="480" w:lineRule="auto"/>
+      <w:spacing w:before="120" w:after="60" w:line="480" w:lineRule="auto"/>
       <w:outlineLvl w:val="2"/>
     </w:pPr>
     <w:rPr>
       <w:rFonts w:asciiTheme="majorHAnsi" w:eastAsiaTheme="majorEastAsia" w:hAnsiTheme="majorHAnsi" w:cstheme="majorBidi" w:ascii="Times New Roman" w:hAnsi="Times New Roman"/>
       <w:b/>
       <w:bCs/>
-      <w:color w:val="4F81BD" w:themeColor="accent1"/>
+      <w:i/>
+      <w:color w:val="000000"/>
       <w:sz w:val="24"/>
+      <w:u w:val="none"/>
     </w:rPr>
   </w:style>
   <w:style w:type="paragraph" w:styleId="Heading4">
@@ -510,16 +515,18 @@
     <w:pPr>
       <w:keepNext/>
       <w:keepLines/>
-      <w:spacing w:before="200" w:after="0"/>
+      <w:spacing w:before="120" w:after="60" w:line="480" w:lineRule="auto"/>
       <w:outlineLvl w:val="3"/>
     </w:pPr>
     <w:rPr>
-      <w:rFonts w:asciiTheme="majorHAnsi" w:eastAsiaTheme="majorEastAsia" w:hAnsiTheme="majorHAnsi" w:cstheme="majorBidi"/>
+      <w:rFonts w:asciiTheme="majorHAnsi" w:eastAsiaTheme="majorEastAsia" w:hAnsiTheme="majorHAnsi" w:cstheme="majorBidi" w:ascii="Times New Roman" w:hAnsi="Times New Roman"/>
       <w:b/>
       <w:bCs/>
       <w:i/>
       <w:iCs/>
-      <w:color w:val="4F81BD" w:themeColor="accent1"/>
+      <w:color w:val="000000"/>
+      <w:sz w:val="24"/>
+      <w:u w:val="none"/>
     </w:rPr>
   </w:style>
   <w:style w:type="paragraph" w:styleId="Heading5">
@@ -728,16 +735,18 @@
       <w:pBdr>
         <w:bottom w:val="single" w:sz="8" w:space="4" w:color="4F81BD" w:themeColor="accent1"/>
       </w:pBdr>
-      <w:spacing w:after="300" w:line="240" w:lineRule="auto"/>
+      <w:spacing w:after="240" w:line="480" w:lineRule="auto" w:before="0"/>
       <w:contextualSpacing/>
     </w:pPr>
     <w:rPr>
-      <w:rFonts w:asciiTheme="majorHAnsi" w:eastAsiaTheme="majorEastAsia" w:hAnsiTheme="majorHAnsi" w:cstheme="majorBidi"/>
-      <w:color w:val="17365D" w:themeColor="text2" w:themeShade="BF"/>
+      <w:rFonts w:asciiTheme="majorHAnsi" w:eastAsiaTheme="majorEastAsia" w:hAnsiTheme="majorHAnsi" w:cstheme="majorBidi" w:ascii="Times New Roman" w:hAnsi="Times New Roman"/>
+      <w:b/>
+      <w:color w:val="000000"/>
       <w:spacing w:val="5"/>
       <w:kern w:val="28"/>
-      <w:sz w:val="52"/>
+      <w:sz w:val="28"/>
       <w:szCs w:val="52"/>
+      <w:u w:val="none"/>
     </w:rPr>
   </w:style>
   <w:style w:type="character" w:customStyle="1" w:styleId="TitleChar">
@@ -767,12 +776,13 @@
       <w:numPr>
         <w:ilvl w:val="1"/>
       </w:numPr>
+      <w:spacing w:line="480" w:lineRule="auto"/>
     </w:pPr>
     <w:rPr>
-      <w:rFonts w:asciiTheme="majorHAnsi" w:eastAsiaTheme="majorEastAsia" w:hAnsiTheme="majorHAnsi" w:cstheme="majorBidi"/>
-      <w:i/>
+      <w:rFonts w:asciiTheme="majorHAnsi" w:eastAsiaTheme="majorEastAsia" w:hAnsiTheme="majorHAnsi" w:cstheme="majorBidi" w:ascii="Times New Roman" w:hAnsi="Times New Roman"/>
+      <w:i w:val="0"/>
       <w:iCs/>
-      <w:color w:val="4F81BD" w:themeColor="accent1"/>
+      <w:color w:val="000000"/>
       <w:spacing w:val="15"/>
       <w:sz w:val="24"/>
       <w:szCs w:val="24"/>
@@ -912,6 +922,11 @@
       </w:numPr>
       <w:contextualSpacing/>
     </w:pPr>
+    <w:rPr>
+      <w:rFonts w:ascii="Times New Roman" w:hAnsi="Times New Roman"/>
+      <w:color w:val="000000"/>
+      <w:sz w:val="24"/>
+    </w:rPr>
   </w:style>
   <w:style w:type="paragraph" w:styleId="ListBullet2">
     <w:name w:val="List Bullet 2"/>
@@ -951,6 +966,11 @@
       </w:numPr>
       <w:contextualSpacing/>
     </w:pPr>
+    <w:rPr>
+      <w:rFonts w:ascii="Times New Roman" w:hAnsi="Times New Roman"/>
+      <w:color w:val="000000"/>
+      <w:sz w:val="24"/>
+    </w:rPr>
   </w:style>
   <w:style w:type="paragraph" w:styleId="ListNumber2">
     <w:name w:val="List Number 2"/>

</xml_diff>